<commit_message>
update admin dashboard and store pages
</commit_message>
<xml_diff>
--- a/KigaliGlow_Project_Report_22618_2023.docx
+++ b/KigaliGlow_Project_Report_22618_2023.docx
@@ -153,10 +153,7 @@
         <w:jc w:val="center"/>
       </w:pPr>
       <w:r>
-        <w:t>lecture</w:t>
-      </w:r>
-      <w:r>
-        <w:t xml:space="preserve">: Eric </w:t>
+        <w:t xml:space="preserve">lecture: Eric </w:t>
       </w:r>
       <w:proofErr w:type="spellStart"/>
       <w:r>
@@ -209,7 +206,15 @@
       </w:r>
       <w:proofErr w:type="spellEnd"/>
       <w:r>
-        <w:t xml:space="preserve"> is a full-stack e-commerce web application developed as a final examination project for the EWA408510 course. The application is a Rwandan beauty and skincare online store that allows customers to browse products, add items to a shopping cart, proceed through checkout, and place orders online. The project was built using modern web technologies including HTML, CSS, JavaScript, Node.js, Express, and SQLite, and was deployed using Docker and GitHub Actions CI/CD pipeline on Render.com.</w:t>
+        <w:t xml:space="preserve"> is a full-stack e-commerce web application </w:t>
+      </w:r>
+      <w:proofErr w:type="gramStart"/>
+      <w:r>
+        <w:t>developed .</w:t>
+      </w:r>
+      <w:proofErr w:type="gramEnd"/>
+      <w:r>
+        <w:t xml:space="preserve"> The application is a Rwandan beauty and skincare online store that allows customers to browse products, add items to a shopping cart, proceed through checkout, and place orders online. The project was built using modern web technologies including HTML, CSS, JavaScript, Node.js, Express, and SQLite, and was deployed using Docker and GitHub Actions CI/CD pipeline on Render.com.</w:t>
       </w:r>
     </w:p>
     <w:p>

</xml_diff>